<commit_message>
Evidencia final del despliegue (20/20) y comparación fija contra el commit anterior
- verificar-despliegue.mjs: JEN-03 diagnostica el último build no exitoso (#12, Quality Gate sin
  cobertura) y JEN-04 reutiliza el build existente sobre el commit HEAD o lo dispara y espera.
- Build #13 de Jenkins sobre Andres-Arango280/task_flow: SUCCESS, Quality Gate OK, 137 pruebas.
- comparar.mjs: la versión anterior es siempre el commit 8b46dc0 (REF_ANTES), no HEAD.
- README_RUBRICA.md, matriz, plan, informe y presentación regenerados.

Co-Authored-By: Claude Fable 5.1 <noreply@anthropic.com>
</commit_message>
<xml_diff>
--- a/pruebas/informe/Plan-de-Pruebas-TaskFlow.docx
+++ b/pruebas/informe/Plan-de-Pruebas-TaskFlow.docx
@@ -85,7 +85,7 @@
           <w:sz w:val="24"/>
           <w:szCs w:val="24"/>
         </w:rPr>
-        <w:t xml:space="preserve">Fecha: 26 de octubre de 2026</w:t>
+        <w:t xml:space="preserve">Fecha: 27 de octubre de 2026</w:t>
       </w:r>
     </w:p>
     <w:p>
@@ -6013,7 +6013,7 @@
                 <w:sz w:val="15"/>
                 <w:szCs w:val="15"/>
               </w:rPr>
-              <w:t xml:space="preserve">19/20</w:t>
+              <w:t xml:space="preserve">20/20</w:t>
             </w:r>
           </w:p>
         </w:tc>
@@ -12985,7 +12985,7 @@
                 <w:sz w:val="18"/>
                 <w:szCs w:val="18"/>
               </w:rPr>
-              <w:t xml:space="preserve">26/10/2026</w:t>
+              <w:t xml:space="preserve">27/10/2026</w:t>
             </w:r>
           </w:p>
         </w:tc>

</xml_diff>